<commit_message>
ispravke plata i pregled organizacija
</commit_message>
<xml_diff>
--- a/frontend/public/templates/Otkaz_ugovora_template.docx
+++ b/frontend/public/templates/Otkaz_ugovora_template.docx
@@ -7,7 +7,7 @@
         <w:jc w:val="both"/>
       </w:pPr>
       <w:r>
-        <w:t xml:space="preserve">Na osnovu člana 96. Zakona o radu Federacije Bosne i Hercegovine („Službene novine FBiH“, br. 26/16, 89/18, 44/22 i 39/24),</w:t>
+        <w:t xml:space="preserve">Na osnovu {{pravna_osnova}} Zakona o radu Federacije Bosne i Hercegovine („Službene novine FBiH“, br. 26/16, 89/18, 44/22 i 39/24),</w:t>
       </w:r>
     </w:p>
     <w:p>
@@ -65,7 +65,7 @@
           <w:b/>
           <w:sz w:val="32"/>
         </w:rPr>
-        <w:t>ODLUKA</w:t>
+        <w:t>ODLUKU</w:t>
       </w:r>
     </w:p>
     <w:p>

</xml_diff>